<commit_message>
docs: synchronize latest reference lesson template
</commit_message>
<xml_diff>
--- a/陈思 六（9）班 《曹冲称象》.docx
+++ b/陈思 六（9）班 《曹冲称象》.docx
@@ -9,10 +9,10 @@
           <wp:anchor distT="0" distB="0" distL="114300" distR="114300" simplePos="0" relativeHeight="251659264" behindDoc="1" locked="0" layoutInCell="1" allowOverlap="1">
             <wp:simplePos x="0" y="0"/>
             <wp:positionH relativeFrom="column">
-              <wp:posOffset>-483235</wp:posOffset>
+              <wp:posOffset>2404745</wp:posOffset>
             </wp:positionH>
             <wp:positionV relativeFrom="paragraph">
-              <wp:posOffset>-359410</wp:posOffset>
+              <wp:posOffset>160020</wp:posOffset>
             </wp:positionV>
             <wp:extent cx="1519555" cy="1492885"/>
             <wp:effectExtent l="0" t="0" r="4445" b="12065"/>
@@ -70,6 +70,8 @@
           <w:szCs w:val="160"/>
         </w:rPr>
       </w:pPr>
+      <w:bookmarkStart w:id="0" w:name="_GoBack"/>
+      <w:bookmarkEnd w:id="0"/>
     </w:p>
     <w:p>
       <w:pPr>
@@ -554,14 +556,6 @@
               <w:gridCol w:w="1540"/>
             </w:tblGrid>
             <w:tr>
-              <w:tblPrEx>
-                <w:tblCellMar>
-                  <w:top w:w="15" w:type="dxa"/>
-                  <w:left w:w="15" w:type="dxa"/>
-                  <w:bottom w:w="15" w:type="dxa"/>
-                  <w:right w:w="15" w:type="dxa"/>
-                </w:tblCellMar>
-              </w:tblPrEx>
               <w:trPr>
                 <w:trHeight w:val="751" w:hRule="atLeast"/>
               </w:trPr>
@@ -1441,19 +1435,7 @@
                       <w:highlight w:val="none"/>
                       <w:lang w:val="en-US" w:eastAsia="zh-CN"/>
                     </w:rPr>
-                    <w:t>2. 辨析“之”字用法：出示“置象大船之上”“访之群下”“称物以载之”，引导学生准确说出“之”字的</w:t>
-                  </w:r>
-                  <w:bookmarkStart w:id="0" w:name="_GoBack"/>
-                  <w:bookmarkEnd w:id="0"/>
-                  <w:r>
-                    <w:rPr>
-                      <w:rFonts w:hint="eastAsia" w:ascii="宋体" w:hAnsi="宋体" w:eastAsia="宋体" w:cs="宋体"/>
-                      <w:sz w:val="22"/>
-                      <w:szCs w:val="28"/>
-                      <w:highlight w:val="none"/>
-                      <w:lang w:val="en-US" w:eastAsia="zh-CN"/>
-                    </w:rPr>
-                    <w:t>用法。</w:t>
+                    <w:t>2. 辨析“之”字用法：出示“置象大船之上”“访之群下”“称物以载之”，引导学生准确说出“之”字的用法。</w:t>
                   </w:r>
                   <w:r>
                     <w:rPr>

</xml_diff>